<commit_message>
docs(registro): memoria v7 actualizada al 21-sep-2026 (edición ligera, semicopulativos, textos legales, métricas)
Co-Authored-By: Claude Opus 5 <noreply@anthropic.com>
</commit_message>
<xml_diff>
--- a/Memoria_Ampliacion_Registro_PI_Taller_Sintaxis_v7.docx
+++ b/Memoria_Ampliacion_Registro_PI_Taller_Sintaxis_v7.docx
@@ -276,7 +276,7 @@
           <w:sz w:val="21"/>
           <w:szCs w:val="21"/>
         </w:rPr>
-        <w:t xml:space="preserve">Este documento describe con fidelidad el estado real del programa a fecha de 30 de agosto de 2026. Los únicos datos que no se han podido consignar son los que constan exclusivamente en la documentación de la inscripción originaria que obra en poder del solicitante; aparecen resaltados en amarillo y deben rellenarse antes de presentar la solicitud:</w:t>
+        <w:t xml:space="preserve">Este documento describe con fidelidad el estado real del programa a fecha de 21 de septiembre de 2026. Los únicos datos que no se han podido consignar son los que constan exclusivamente en la documentación de la inscripción originaria que obra en poder del solicitante; aparecen resaltados en amarillo y deben rellenarse antes de presentar la solicitud:</w:t>
       </w:r>
     </w:p>
     <w:p>
@@ -969,7 +969,7 @@
                 <w:sz w:val="19"/>
                 <w:szCs w:val="19"/>
               </w:rPr>
-              <w:t xml:space="preserve">v7 (agosto de 2026)</w:t>
+              <w:t xml:space="preserve">v7 (septiembre de 2026)</w:t>
             </w:r>
           </w:p>
         </w:tc>
@@ -1087,7 +1087,7 @@
                 <w:sz w:val="19"/>
                 <w:szCs w:val="19"/>
               </w:rPr>
-              <w:t xml:space="preserve">30 de agosto de 2026</w:t>
+              <w:t xml:space="preserve">21 de septiembre de 2026</w:t>
             </w:r>
           </w:p>
         </w:tc>
@@ -1146,7 +1146,7 @@
                 <w:sz w:val="19"/>
                 <w:szCs w:val="19"/>
               </w:rPr>
-              <w:t xml:space="preserve">Más de 46.000 líneas de código propio</w:t>
+              <w:t xml:space="preserve">Más de 46.900 líneas de código propio</w:t>
             </w:r>
           </w:p>
         </w:tc>
@@ -1178,7 +1178,7 @@
                 <w:sz w:val="19"/>
                 <w:szCs w:val="19"/>
               </w:rPr>
-              <w:t xml:space="preserve">Ámbito de uso previsto</w:t>
+              <w:t xml:space="preserve">Ediciones</w:t>
             </w:r>
           </w:p>
         </w:tc>
@@ -1205,7 +1205,7 @@
                 <w:sz w:val="19"/>
                 <w:szCs w:val="19"/>
               </w:rPr>
-              <w:t xml:space="preserve">Educación Secundaria Obligatoria y Bachillerato (España y ámbito hispanohablante)</w:t>
+              <w:t xml:space="preserve">Dos, generadas desde el mismo código fuente: la edición completa (para el centro educativo, con servidor y panel del profesor) y la edición ligera (pública, funciona íntegramente en el navegador sin servidor)</w:t>
             </w:r>
           </w:p>
         </w:tc>
@@ -1237,7 +1237,7 @@
                 <w:sz w:val="19"/>
                 <w:szCs w:val="19"/>
               </w:rPr>
-              <w:t xml:space="preserve">Lengua del sistema</w:t>
+              <w:t xml:space="preserve">Ámbito de uso previsto</w:t>
             </w:r>
           </w:p>
         </w:tc>
@@ -1264,7 +1264,7 @@
                 <w:sz w:val="19"/>
                 <w:szCs w:val="19"/>
               </w:rPr>
-              <w:t xml:space="preserve">Español, con terminología conforme a RAE/NGLE</w:t>
+              <w:t xml:space="preserve">Educación Secundaria Obligatoria y Bachillerato (España y ámbito hispanohablante)</w:t>
             </w:r>
           </w:p>
         </w:tc>
@@ -1296,6 +1296,65 @@
                 <w:sz w:val="19"/>
                 <w:szCs w:val="19"/>
               </w:rPr>
+              <w:t xml:space="preserve">Lengua del sistema</w:t>
+            </w:r>
+          </w:p>
+        </w:tc>
+        <w:tc>
+          <w:tcPr>
+            <w:tcW w:type="dxa" w:w="6654"/>
+            <w:tcMar>
+              <w:top w:type="dxa" w:w="90"/>
+              <w:left w:type="dxa" w:w="130"/>
+              <w:bottom w:type="dxa" w:w="90"/>
+              <w:right w:type="dxa" w:w="130"/>
+            </w:tcMar>
+          </w:tcPr>
+          <w:p>
+            <w:pPr>
+              <w:spacing w:after="0" w:line="260"/>
+            </w:pPr>
+            <w:r>
+              <w:rPr>
+                <w:rFonts w:ascii="Georgia" w:cs="Georgia" w:eastAsia="Georgia" w:hAnsi="Georgia"/>
+                <w:b w:val="false"/>
+                <w:bCs w:val="false"/>
+                <w:color w:val="1F2937"/>
+                <w:sz w:val="19"/>
+                <w:szCs w:val="19"/>
+              </w:rPr>
+              <w:t xml:space="preserve">Español, con terminología conforme a RAE/NGLE</w:t>
+            </w:r>
+          </w:p>
+        </w:tc>
+      </w:tr>
+      <w:tr>
+        <w:trPr>
+          <w:tblHeader w:val="false"/>
+        </w:trPr>
+        <w:tc>
+          <w:tcPr>
+            <w:tcW w:type="dxa" w:w="2852"/>
+            <w:tcMar>
+              <w:top w:type="dxa" w:w="90"/>
+              <w:left w:type="dxa" w:w="130"/>
+              <w:bottom w:type="dxa" w:w="90"/>
+              <w:right w:type="dxa" w:w="130"/>
+            </w:tcMar>
+          </w:tcPr>
+          <w:p>
+            <w:pPr>
+              <w:spacing w:after="0" w:line="260"/>
+            </w:pPr>
+            <w:r>
+              <w:rPr>
+                <w:rFonts w:ascii="Georgia" w:cs="Georgia" w:eastAsia="Georgia" w:hAnsi="Georgia"/>
+                <w:b/>
+                <w:bCs/>
+                <w:color w:val="1F2937"/>
+                <w:sz w:val="19"/>
+                <w:szCs w:val="19"/>
+              </w:rPr>
               <w:t xml:space="preserve">Estado</w:t>
             </w:r>
           </w:p>
@@ -1323,7 +1382,7 @@
                 <w:sz w:val="19"/>
                 <w:szCs w:val="19"/>
               </w:rPr>
-              <w:t xml:space="preserve">En explotación real en el aula; uso compartido con el departamento de Lengua Castellana y Literatura mediante cuadernos independientes por profesor</w:t>
+              <w:t xml:space="preserve">En explotación real en el aula; uso compartido con el departamento de Lengua Castellana y Literatura mediante cuadernos independientes por profesor; edición ligera preparada para su publicación en dominio propio</w:t>
             </w:r>
           </w:p>
         </w:tc>
@@ -1521,7 +1580,7 @@
           <w:sz w:val="21"/>
           <w:szCs w:val="21"/>
         </w:rPr>
-        <w:t xml:space="preserve">Cuatro meses después, la obra ha multiplicado por seis su extensión y ha cambiado de naturaleza interna. Ya no es un fichero: es una aplicación modular de más de cuarenta y seis mil líneas de código propio, organizada en más de cincuenta módulos independientes, con siete módulos didácticos —dos de ellos completamente nuevos y de concepción original— y un sistema de evaluación con calificación verificada en servidor. La presente memoria documenta ese crecimiento a fin de ampliar la inscripción registral con la versión vigente del programa.</w:t>
+        <w:t xml:space="preserve">Cinco meses después, la obra ha multiplicado por seis su extensión y ha cambiado de naturaleza interna. Ya no es un fichero: es una aplicación modular de más de cuarenta y seis mil líneas de código propio, organizada en más de cincuenta módulos independientes, con siete módulos didácticos —dos de ellos completamente nuevos y de concepción original—, un sistema de evaluación con calificación verificada en servidor y dos ediciones generadas desde el mismo código: una completa para el centro educativo y una ligera, pública, que funciona sin servidor. La presente memoria documenta ese crecimiento a fin de ampliar la inscripción registral con la versión vigente del programa.</w:t>
       </w:r>
     </w:p>
     <w:p>
@@ -1701,6 +1760,46 @@
           <w:szCs w:val="21"/>
         </w:rPr>
         <w:t xml:space="preserve">La reescritura completa de la arquitectura, del fichero monolítico a un sistema de módulos nativos de JavaScript, sin dependencias de terceros, con funcionamiento sin conexión.</w:t>
+      </w:r>
+    </w:p>
+    <w:p>
+      <w:pPr>
+        <w:pStyle w:val="ListParagraph"/>
+        <w:numPr>
+          <w:ilvl w:val="0"/>
+          <w:numId w:val="2"/>
+        </w:numPr>
+        <w:spacing w:after="90" w:line="290"/>
+        <w:jc w:val="both"/>
+      </w:pPr>
+      <w:r>
+        <w:rPr>
+          <w:rFonts w:ascii="Georgia" w:cs="Georgia" w:eastAsia="Georgia" w:hAnsi="Georgia"/>
+          <w:color w:val="1F2937"/>
+          <w:sz w:val="21"/>
+          <w:szCs w:val="21"/>
+        </w:rPr>
+        <w:t xml:space="preserve">Una edición ligera de la obra, generada automáticamente a partir del mismo código fuente mediante un constructor propio, que funciona íntegramente en el navegador —sin servidor, sin panel del profesor y sin registro de datos— gracias a bancos locales de oraciones simples, oraciones compuestas y textos morfológicos incorporados a la propia aplicación; incluye aviso legal y política de privacidad propios.</w:t>
+      </w:r>
+    </w:p>
+    <w:p>
+      <w:pPr>
+        <w:pStyle w:val="ListParagraph"/>
+        <w:numPr>
+          <w:ilvl w:val="0"/>
+          <w:numId w:val="2"/>
+        </w:numPr>
+        <w:spacing w:after="90" w:line="290"/>
+        <w:jc w:val="both"/>
+      </w:pPr>
+      <w:r>
+        <w:rPr>
+          <w:rFonts w:ascii="Georgia" w:cs="Georgia" w:eastAsia="Georgia" w:hAnsi="Georgia"/>
+          <w:color w:val="1F2937"/>
+          <w:sz w:val="21"/>
+          <w:szCs w:val="21"/>
+        </w:rPr>
+        <w:t xml:space="preserve">El tratamiento didáctico específico de los verbos semicopulativos en el módulo de la oración simple: decisión del tipo de predicado en dos tiempos, micro-lección propia con las tres pruebas de la NGLE y seguimiento del error correspondiente hasta el informe del profesor.</w:t>
       </w:r>
     </w:p>
     <w:p>
@@ -1842,7 +1941,7 @@
                 <w:sz w:val="19"/>
                 <w:szCs w:val="19"/>
               </w:rPr>
-              <w:t xml:space="preserve">v7 (agosto 2026, esta ampliación)</w:t>
+              <w:t xml:space="preserve">v7 (septiembre 2026, esta ampliación)</w:t>
             </w:r>
           </w:p>
         </w:tc>
@@ -2014,7 +2113,7 @@
                 <w:sz w:val="19"/>
                 <w:szCs w:val="19"/>
               </w:rPr>
-              <w:t xml:space="preserve">≈ 25.000 líneas de JavaScript + ≈ 10.400 de HTML y CSS</w:t>
+              <w:t xml:space="preserve">≈ 25.800 líneas de JavaScript + ≈ 10.200 de HTML y CSS</w:t>
             </w:r>
           </w:p>
         </w:tc>
@@ -2100,7 +2199,7 @@
                 <w:sz w:val="19"/>
                 <w:szCs w:val="19"/>
               </w:rPr>
-              <w:t xml:space="preserve">≈ 10.500 líneas en 13 ficheros de Google Apps Script</w:t>
+              <w:t xml:space="preserve">≈ 10.550 líneas en 13 ficheros de Google Apps Script</w:t>
             </w:r>
           </w:p>
         </w:tc>
@@ -2132,7 +2231,7 @@
                 <w:sz w:val="19"/>
                 <w:szCs w:val="19"/>
               </w:rPr>
-              <w:t xml:space="preserve">Módulos didácticos</w:t>
+              <w:t xml:space="preserve">Ediciones</w:t>
             </w:r>
           </w:p>
         </w:tc>
@@ -2159,7 +2258,7 @@
                 <w:sz w:val="19"/>
                 <w:szCs w:val="19"/>
               </w:rPr>
-              <w:t xml:space="preserve">3 (Simples, Morfología, Sintagmas)</w:t>
+              <w:t xml:space="preserve">Una</w:t>
             </w:r>
           </w:p>
         </w:tc>
@@ -2186,7 +2285,7 @@
                 <w:sz w:val="19"/>
                 <w:szCs w:val="19"/>
               </w:rPr>
-              <w:t xml:space="preserve">7 (Simples, Compuestas, Morfología, Sintagmas, Chispa, Laboratorio, Fábrica)</w:t>
+              <w:t xml:space="preserve">Dos: completa (centro educativo, con servidor) y ligera (pública, sin servidor), generadas desde el mismo código</w:t>
             </w:r>
           </w:p>
         </w:tc>
@@ -2218,7 +2317,7 @@
                 <w:sz w:val="19"/>
                 <w:szCs w:val="19"/>
               </w:rPr>
-              <w:t xml:space="preserve">Modos de práctica</w:t>
+              <w:t xml:space="preserve">Módulos didácticos</w:t>
             </w:r>
           </w:p>
         </w:tc>
@@ -2245,7 +2344,7 @@
                 <w:sz w:val="19"/>
                 <w:szCs w:val="19"/>
               </w:rPr>
-              <w:t xml:space="preserve">Arcade con 2 submodos</w:t>
+              <w:t xml:space="preserve">3 (Simples, Morfología, Sintagmas)</w:t>
             </w:r>
           </w:p>
         </w:tc>
@@ -2272,7 +2371,7 @@
                 <w:sz w:val="19"/>
                 <w:szCs w:val="19"/>
               </w:rPr>
-              <w:t xml:space="preserve">Arcade con 4 submodos + gamificación transversal</w:t>
+              <w:t xml:space="preserve">7 (Simples, Compuestas, Morfología, Sintagmas, Chispa, Laboratorio, Fábrica)</w:t>
             </w:r>
           </w:p>
         </w:tc>
@@ -2304,7 +2403,7 @@
                 <w:sz w:val="19"/>
                 <w:szCs w:val="19"/>
               </w:rPr>
-              <w:t xml:space="preserve">Banco de oraciones simples</w:t>
+              <w:t xml:space="preserve">Modos de práctica</w:t>
             </w:r>
           </w:p>
         </w:tc>
@@ -2331,7 +2430,7 @@
                 <w:sz w:val="19"/>
                 <w:szCs w:val="19"/>
               </w:rPr>
-              <w:t xml:space="preserve">Más de 240 oraciones analizadas</w:t>
+              <w:t xml:space="preserve">Arcade con 2 submodos</w:t>
             </w:r>
           </w:p>
         </w:tc>
@@ -2358,7 +2457,7 @@
                 <w:sz w:val="19"/>
                 <w:szCs w:val="19"/>
               </w:rPr>
-              <w:t xml:space="preserve">Más de 650 oraciones analizadas</w:t>
+              <w:t xml:space="preserve">Arcade con 4 submodos + gamificación transversal</w:t>
             </w:r>
           </w:p>
         </w:tc>
@@ -2390,7 +2489,7 @@
                 <w:sz w:val="19"/>
                 <w:szCs w:val="19"/>
               </w:rPr>
-              <w:t xml:space="preserve">Bancos nuevos</w:t>
+              <w:t xml:space="preserve">Banco de oraciones simples</w:t>
             </w:r>
           </w:p>
         </w:tc>
@@ -2417,7 +2516,7 @@
                 <w:sz w:val="19"/>
                 <w:szCs w:val="19"/>
               </w:rPr>
-              <w:t xml:space="preserve">—</w:t>
+              <w:t xml:space="preserve">Más de 240 oraciones analizadas</w:t>
             </w:r>
           </w:p>
         </w:tc>
@@ -2444,7 +2543,7 @@
                 <w:sz w:val="19"/>
                 <w:szCs w:val="19"/>
               </w:rPr>
-              <w:t xml:space="preserve">Oración compuesta (≈ 250 ejercicios), Laboratorio (≈ 210 retos), Fábrica (122 retos), corpus morfológico por niveles</w:t>
+              <w:t xml:space="preserve">Más de 650 oraciones analizadas</w:t>
             </w:r>
           </w:p>
         </w:tc>
@@ -2476,7 +2575,7 @@
                 <w:sz w:val="19"/>
                 <w:szCs w:val="19"/>
               </w:rPr>
-              <w:t xml:space="preserve">Evaluación</w:t>
+              <w:t xml:space="preserve">Bancos nuevos</w:t>
             </w:r>
           </w:p>
         </w:tc>
@@ -2503,7 +2602,7 @@
                 <w:sz w:val="19"/>
                 <w:szCs w:val="19"/>
               </w:rPr>
-              <w:t xml:space="preserve">Examen con PIN en el módulo de simples; nota calculada en el navegador</w:t>
+              <w:t xml:space="preserve">—</w:t>
             </w:r>
           </w:p>
         </w:tc>
@@ -2530,7 +2629,7 @@
                 <w:sz w:val="19"/>
                 <w:szCs w:val="19"/>
               </w:rPr>
-              <w:t xml:space="preserve">Examen con PIN en seis módulos; nota calculada y firmada en el servidor, con vale de entrega de un solo uso</w:t>
+              <w:t xml:space="preserve">Oración compuesta (≈ 250 ejercicios), Laboratorio (≈ 210 retos), Fábrica (122 retos), corpus morfológico por niveles, y bancos locales de la edición ligera (165 simples, 80 compuestas, 88 textos morfológicos)</w:t>
             </w:r>
           </w:p>
         </w:tc>
@@ -2562,7 +2661,7 @@
                 <w:sz w:val="19"/>
                 <w:szCs w:val="19"/>
               </w:rPr>
-              <w:t xml:space="preserve">Informes</w:t>
+              <w:t xml:space="preserve">Evaluación</w:t>
             </w:r>
           </w:p>
         </w:tc>
@@ -2589,7 +2688,7 @@
                 <w:sz w:val="19"/>
                 <w:szCs w:val="19"/>
               </w:rPr>
-              <w:t xml:space="preserve">Exportación CSV</w:t>
+              <w:t xml:space="preserve">Examen con PIN en el módulo de simples; nota calculada en el navegador</w:t>
             </w:r>
           </w:p>
         </w:tc>
@@ -2616,7 +2715,7 @@
                 <w:sz w:val="19"/>
                 <w:szCs w:val="19"/>
               </w:rPr>
-              <w:t xml:space="preserve">Informe en hoja de cálculo con escala de color, ranking, errores por función, analíticas de evolución y envío por correo a cada alumno</w:t>
+              <w:t xml:space="preserve">Examen con PIN en seis módulos; nota calculada y firmada en el servidor, con vale de entrega de un solo uso</w:t>
             </w:r>
           </w:p>
         </w:tc>
@@ -2648,7 +2747,7 @@
                 <w:sz w:val="19"/>
                 <w:szCs w:val="19"/>
               </w:rPr>
-              <w:t xml:space="preserve">Usuarios docentes</w:t>
+              <w:t xml:space="preserve">Informes</w:t>
             </w:r>
           </w:p>
         </w:tc>
@@ -2675,7 +2774,7 @@
                 <w:sz w:val="19"/>
                 <w:szCs w:val="19"/>
               </w:rPr>
-              <w:t xml:space="preserve">Un solo profesor</w:t>
+              <w:t xml:space="preserve">Exportación CSV</w:t>
             </w:r>
           </w:p>
         </w:tc>
@@ -2702,7 +2801,7 @@
                 <w:sz w:val="19"/>
                 <w:szCs w:val="19"/>
               </w:rPr>
-              <w:t xml:space="preserve">Cuadernos independientes por profesor (uso departamental)</w:t>
+              <w:t xml:space="preserve">Informe en hoja de cálculo con escala de color, ranking, errores por función y por alumno, analíticas de evolución y envío por correo a cada alumno</w:t>
             </w:r>
           </w:p>
         </w:tc>
@@ -2734,6 +2833,92 @@
                 <w:sz w:val="19"/>
                 <w:szCs w:val="19"/>
               </w:rPr>
+              <w:t xml:space="preserve">Usuarios docentes</w:t>
+            </w:r>
+          </w:p>
+        </w:tc>
+        <w:tc>
+          <w:tcPr>
+            <w:tcW w:type="dxa" w:w="3422"/>
+            <w:tcMar>
+              <w:top w:type="dxa" w:w="90"/>
+              <w:left w:type="dxa" w:w="130"/>
+              <w:bottom w:type="dxa" w:w="90"/>
+              <w:right w:type="dxa" w:w="130"/>
+            </w:tcMar>
+          </w:tcPr>
+          <w:p>
+            <w:pPr>
+              <w:spacing w:after="0" w:line="260"/>
+            </w:pPr>
+            <w:r>
+              <w:rPr>
+                <w:rFonts w:ascii="Georgia" w:cs="Georgia" w:eastAsia="Georgia" w:hAnsi="Georgia"/>
+                <w:b w:val="false"/>
+                <w:bCs w:val="false"/>
+                <w:color w:val="1F2937"/>
+                <w:sz w:val="19"/>
+                <w:szCs w:val="19"/>
+              </w:rPr>
+              <w:t xml:space="preserve">Un solo profesor</w:t>
+            </w:r>
+          </w:p>
+        </w:tc>
+        <w:tc>
+          <w:tcPr>
+            <w:tcW w:type="dxa" w:w="3993"/>
+            <w:tcMar>
+              <w:top w:type="dxa" w:w="90"/>
+              <w:left w:type="dxa" w:w="130"/>
+              <w:bottom w:type="dxa" w:w="90"/>
+              <w:right w:type="dxa" w:w="130"/>
+            </w:tcMar>
+          </w:tcPr>
+          <w:p>
+            <w:pPr>
+              <w:spacing w:after="0" w:line="260"/>
+            </w:pPr>
+            <w:r>
+              <w:rPr>
+                <w:rFonts w:ascii="Georgia" w:cs="Georgia" w:eastAsia="Georgia" w:hAnsi="Georgia"/>
+                <w:b w:val="false"/>
+                <w:bCs w:val="false"/>
+                <w:color w:val="1F2937"/>
+                <w:sz w:val="19"/>
+                <w:szCs w:val="19"/>
+              </w:rPr>
+              <w:t xml:space="preserve">Cuadernos independientes por profesor (uso departamental)</w:t>
+            </w:r>
+          </w:p>
+        </w:tc>
+      </w:tr>
+      <w:tr>
+        <w:trPr>
+          <w:tblHeader w:val="false"/>
+        </w:trPr>
+        <w:tc>
+          <w:tcPr>
+            <w:tcW w:type="dxa" w:w="2091"/>
+            <w:tcMar>
+              <w:top w:type="dxa" w:w="90"/>
+              <w:left w:type="dxa" w:w="130"/>
+              <w:bottom w:type="dxa" w:w="90"/>
+              <w:right w:type="dxa" w:w="130"/>
+            </w:tcMar>
+          </w:tcPr>
+          <w:p>
+            <w:pPr>
+              <w:spacing w:after="0" w:line="260"/>
+            </w:pPr>
+            <w:r>
+              <w:rPr>
+                <w:rFonts w:ascii="Georgia" w:cs="Georgia" w:eastAsia="Georgia" w:hAnsi="Georgia"/>
+                <w:b w:val="false"/>
+                <w:bCs w:val="false"/>
+                <w:color w:val="1F2937"/>
+                <w:sz w:val="19"/>
+                <w:szCs w:val="19"/>
+              </w:rPr>
               <w:t xml:space="preserve">Funcionamiento sin red</w:t>
             </w:r>
           </w:p>
@@ -2789,6 +2974,92 @@
                 <w:szCs w:val="19"/>
               </w:rPr>
               <w:t xml:space="preserve">Sí: aplicación web progresiva con caché propia y guardián de arranque</w:t>
+            </w:r>
+          </w:p>
+        </w:tc>
+      </w:tr>
+      <w:tr>
+        <w:trPr>
+          <w:tblHeader w:val="false"/>
+        </w:trPr>
+        <w:tc>
+          <w:tcPr>
+            <w:tcW w:type="dxa" w:w="2091"/>
+            <w:tcMar>
+              <w:top w:type="dxa" w:w="90"/>
+              <w:left w:type="dxa" w:w="130"/>
+              <w:bottom w:type="dxa" w:w="90"/>
+              <w:right w:type="dxa" w:w="130"/>
+            </w:tcMar>
+          </w:tcPr>
+          <w:p>
+            <w:pPr>
+              <w:spacing w:after="0" w:line="260"/>
+            </w:pPr>
+            <w:r>
+              <w:rPr>
+                <w:rFonts w:ascii="Georgia" w:cs="Georgia" w:eastAsia="Georgia" w:hAnsi="Georgia"/>
+                <w:b w:val="false"/>
+                <w:bCs w:val="false"/>
+                <w:color w:val="1F2937"/>
+                <w:sz w:val="19"/>
+                <w:szCs w:val="19"/>
+              </w:rPr>
+              <w:t xml:space="preserve">Textos legales</w:t>
+            </w:r>
+          </w:p>
+        </w:tc>
+        <w:tc>
+          <w:tcPr>
+            <w:tcW w:type="dxa" w:w="3422"/>
+            <w:tcMar>
+              <w:top w:type="dxa" w:w="90"/>
+              <w:left w:type="dxa" w:w="130"/>
+              <w:bottom w:type="dxa" w:w="90"/>
+              <w:right w:type="dxa" w:w="130"/>
+            </w:tcMar>
+          </w:tcPr>
+          <w:p>
+            <w:pPr>
+              <w:spacing w:after="0" w:line="260"/>
+            </w:pPr>
+            <w:r>
+              <w:rPr>
+                <w:rFonts w:ascii="Georgia" w:cs="Georgia" w:eastAsia="Georgia" w:hAnsi="Georgia"/>
+                <w:b w:val="false"/>
+                <w:bCs w:val="false"/>
+                <w:color w:val="1F2937"/>
+                <w:sz w:val="19"/>
+                <w:szCs w:val="19"/>
+              </w:rPr>
+              <w:t xml:space="preserve">—</w:t>
+            </w:r>
+          </w:p>
+        </w:tc>
+        <w:tc>
+          <w:tcPr>
+            <w:tcW w:type="dxa" w:w="3993"/>
+            <w:tcMar>
+              <w:top w:type="dxa" w:w="90"/>
+              <w:left w:type="dxa" w:w="130"/>
+              <w:bottom w:type="dxa" w:w="90"/>
+              <w:right w:type="dxa" w:w="130"/>
+            </w:tcMar>
+          </w:tcPr>
+          <w:p>
+            <w:pPr>
+              <w:spacing w:after="0" w:line="260"/>
+            </w:pPr>
+            <w:r>
+              <w:rPr>
+                <w:rFonts w:ascii="Georgia" w:cs="Georgia" w:eastAsia="Georgia" w:hAnsi="Georgia"/>
+                <w:b w:val="false"/>
+                <w:bCs w:val="false"/>
+                <w:color w:val="1F2937"/>
+                <w:sz w:val="19"/>
+                <w:szCs w:val="19"/>
+              </w:rPr>
+              <w:t xml:space="preserve">Aviso legal y política de privacidad propios, enlazados desde la aplicación</w:t>
             </w:r>
           </w:p>
         </w:tc>
@@ -2828,7 +3099,7 @@
           <w:sz w:val="21"/>
           <w:szCs w:val="21"/>
         </w:rPr>
-        <w:t xml:space="preserve">Terminología estricta conforme a la Nueva Gramática de la Lengua Española (RAE/NGLE, 2009). En la versión 7 esta exigencia se ha llevado hasta el detalle de la interfaz: el programa no emplea nunca el término «grupo» (usa «sintagma»), no muestra al alumno los términos «proposición principal» ni «proposición subordinada» —cada cláusula se denomina «oración» y se numera O1, O2, O3—, y la preposición sigue siendo el núcleo del sintagma preposicional.</w:t>
+        <w:t xml:space="preserve">Terminología estricta conforme a la Nueva Gramática de la Lengua Española (RAE/NGLE, 2009). En la versión 7 esta exigencia se ha llevado hasta el detalle de la interfaz: el programa no emplea nunca el término «grupo» (usa «sintagma»), no muestra al alumno los términos «proposición principal» ni «proposición subordinada» —cada cláusula se denomina «oración» y se numera O1, O2, O3—, la preposición sigue siendo el núcleo del sintagma preposicional y la negación recibe su función propia de modificador oracional.</w:t>
       </w:r>
     </w:p>
     <w:p>
@@ -2868,7 +3139,7 @@
           <w:sz w:val="21"/>
           <w:szCs w:val="21"/>
         </w:rPr>
-        <w:t xml:space="preserve">EBAU / PAU de la Región de Murcia. El flujo de análisis, las etiquetas de función y la pauta de respuesta modelo del nivel superior de morfología reproducen los criterios exigidos en la prueba de acceso a la universidad de la Región de Murcia.</w:t>
+        <w:t xml:space="preserve">PAU de la Región de Murcia. El flujo de análisis, las etiquetas de función, el resumen final del análisis de la oración compuesta y la pauta de respuesta modelo del nivel superior de morfología reproducen los criterios exigidos en la prueba de acceso a la universidad de la Región de Murcia. En la edición ligera, de ámbito general, esa referencia se expresa de forma neutra («prueba de acceso a la universidad») sin alterar el contenido.</w:t>
       </w:r>
     </w:p>
     <w:p>
@@ -3903,7 +4174,7 @@
           <w:sz w:val="21"/>
           <w:szCs w:val="21"/>
         </w:rPr>
-        <w:t xml:space="preserve">El alumno recorre el análisis en cuatro pasos guiados —identificar los verbos, identificar los nexos, delimitar las oraciones y clasificar la relación entre ellas (coordinación con sus subtipos, subordinación con los suyos, y yuxtaposición)— con tres modalidades de uso: lectura comentada, práctica libre con retroalimentación escalonada y examen calificado. Dispone de retroalimentación propia (micro-lecciones y pistas específicas del módulo), banco propio y backend dedicado.</w:t>
+        <w:t xml:space="preserve">El alumno recorre el análisis en cuatro pasos guiados —identificar los verbos, identificar los nexos, delimitar las oraciones y clasificar la relación entre ellas (coordinación con sus subtipos, subordinación con los suyos, y yuxtaposición)— con tres modalidades de uso: lectura comentada, práctica libre con retroalimentación escalonada y examen calificado. Al cerrar cada ejercicio, el módulo redacta un resumen del análisis con la pauta de la prueba de acceso a la universidad, que recorre correctamente también las subordinadas encadenadas —una oración subordinada dentro de otra subordinada— y las oraciones embebidas. Dispone de retroalimentación propia (micro-lecciones y pistas específicas del módulo), banco propio y backend dedicado.</w:t>
       </w:r>
     </w:p>
     <w:p>
@@ -4068,7 +4339,7 @@
           <w:sz w:val="21"/>
           <w:szCs w:val="21"/>
         </w:rPr>
-        <w:t xml:space="preserve">Los resultados se registran de forma persistente, con protección frente a envíos duplicados. El profesorado dispone de informes descargables en hoja de cálculo con notas por alumno, escala de cuatro colores, ranking, errores más frecuentes por función —ponderados por pilar, función y procedimiento—, minigráficos de evolución, tabla por grupo y una hoja de analítica evolutiva. El sistema permite además enviar automáticamente a cada alumno, por correo electrónico, su calificación y sus errores más frecuentes, mediante un diálogo que permite seleccionar grupo, intervalo de fechas y destinatarios uno a uno.</w:t>
+        <w:t xml:space="preserve">Los resultados se registran de forma persistente, con protección frente a envíos duplicados. El profesorado dispone de informes descargables en hoja de cálculo con notas por alumno, escala de cuatro colores, ranking, errores más frecuentes por función —ponderados por pilar, función y procedimiento—, minigráficos de evolución, tabla por grupo, una hoja de analítica evolutiva y, en el módulo de la oración compuesta, una vista de los errores concretos de cada alumno en cada examen. El sistema permite además enviar automáticamente a cada alumno, por correo electrónico, su calificación y sus errores más frecuentes, mediante un diálogo que permite seleccionar grupo, intervalo de fechas y destinatarios uno a uno.</w:t>
       </w:r>
     </w:p>
     <w:p>
@@ -4195,7 +4466,136 @@
           <w:sz w:val="23"/>
           <w:szCs w:val="23"/>
         </w:rPr>
-        <w:t xml:space="preserve">2.9 Otras mejoras funcionales</w:t>
+        <w:t xml:space="preserve">2.9 Verbos semicopulativos en la oración simple</w:t>
+      </w:r>
+    </w:p>
+    <w:p>
+      <w:pPr>
+        <w:spacing w:after="140" w:line="300"/>
+        <w:jc w:val="both"/>
+      </w:pPr>
+      <w:r>
+        <w:rPr>
+          <w:rFonts w:ascii="Georgia" w:cs="Georgia" w:eastAsia="Georgia" w:hAnsi="Georgia"/>
+          <w:b w:val="false"/>
+          <w:bCs w:val="false"/>
+          <w:i w:val="false"/>
+          <w:iCs w:val="false"/>
+          <w:color w:val="1F2937"/>
+          <w:sz w:val="21"/>
+          <w:szCs w:val="21"/>
+        </w:rPr>
+        <w:t xml:space="preserve">La versión de septiembre resuelve un problema didáctico detectado en el aula con oraciones como «La biblioteca se veía vacía»: el alumno que razonaba bien —«no expresa acción, es atributiva: predicado nominal»— era penalizado por no haber elegido una tercera opción secundaria («predicado nominal con verbo semicopulativo») que la interfaz mostraba en pequeño. No era un error del motor ni de los datos, sino de diseño, y se ha corregido en el diseño.</w:t>
+      </w:r>
+    </w:p>
+    <w:p>
+      <w:pPr>
+        <w:spacing w:after="140" w:line="300"/>
+        <w:jc w:val="both"/>
+      </w:pPr>
+      <w:r>
+        <w:rPr>
+          <w:rFonts w:ascii="Georgia" w:cs="Georgia" w:eastAsia="Georgia" w:hAnsi="Georgia"/>
+          <w:b w:val="false"/>
+          <w:bCs w:val="false"/>
+          <w:i w:val="false"/>
+          <w:iCs w:val="false"/>
+          <w:color w:val="1F2937"/>
+          <w:sz w:val="21"/>
+          <w:szCs w:val="21"/>
+        </w:rPr>
+        <w:t xml:space="preserve">Ahora la decisión del tipo de predicado se toma en dos tiempos dentro de la misma tarjeta: primero, nominal o verbal; después, y solo si el verbo lo exige, copulativo o semicopulativo. Cada tiempo tiene su andamiaje propio. Acompaña al rediseño una micro-lección nueva, «Verbos semicopulativos», que expone las tres pruebas que separan al verbo semicopulativo del copulativo pleno —suprimir lo que sigue al verbo, sustituirlo por «lo» y sustituirlo por «así», aplicadas juntas y con la segunda como decisiva— y las tres clases semánticas de la NGLE (cambio, permanencia y manifestación), con el caso del mismo verbo «en dos trajes» («salió a la calle» frente a «salió redondo»). El error correspondiente se registra por primera vez de principio a fin —del navegador al servidor y de ahí al informe del profesor, con etiqueta legible «Tipo de predicado (semicopulativo)»— y el banco de oraciones cuenta con un subconjunto propio de dieciséis oraciones con verbo semicopulativo revisadas una a una.</w:t>
+      </w:r>
+    </w:p>
+    <w:p>
+      <w:pPr>
+        <w:pStyle w:val="Heading2"/>
+        <w:spacing w:after="140" w:before="300"/>
+      </w:pPr>
+      <w:r>
+        <w:rPr>
+          <w:rFonts w:ascii="Georgia" w:cs="Georgia" w:eastAsia="Georgia" w:hAnsi="Georgia"/>
+          <w:b/>
+          <w:bCs/>
+          <w:color w:val="1F2937"/>
+          <w:sz w:val="23"/>
+          <w:szCs w:val="23"/>
+        </w:rPr>
+        <w:t xml:space="preserve">2.10 La edición ligera: la obra sin servidor</w:t>
+      </w:r>
+    </w:p>
+    <w:p>
+      <w:pPr>
+        <w:spacing w:after="140" w:line="300"/>
+        <w:jc w:val="both"/>
+      </w:pPr>
+      <w:r>
+        <w:rPr>
+          <w:rFonts w:ascii="Georgia" w:cs="Georgia" w:eastAsia="Georgia" w:hAnsi="Georgia"/>
+          <w:b w:val="false"/>
+          <w:bCs w:val="false"/>
+          <w:i w:val="false"/>
+          <w:iCs w:val="false"/>
+          <w:color w:val="1F2937"/>
+          <w:sz w:val="21"/>
+          <w:szCs w:val="21"/>
+        </w:rPr>
+        <w:t xml:space="preserve">La novedad de mayor alcance de septiembre no es un módulo, sino una segunda forma de existir de la obra. A partir del mismo código fuente, un constructor propio genera una edición ligera destinada a su publicación en un dominio propio y de uso libre: funciona íntegramente en el navegador del usuario, sin servidor, sin panel del profesor, sin exámenes con PIN y sin registro de datos personales de ningún tipo.</w:t>
+      </w:r>
+    </w:p>
+    <w:p>
+      <w:pPr>
+        <w:spacing w:after="140" w:line="300"/>
+        <w:jc w:val="both"/>
+      </w:pPr>
+      <w:r>
+        <w:rPr>
+          <w:rFonts w:ascii="Georgia" w:cs="Georgia" w:eastAsia="Georgia" w:hAnsi="Georgia"/>
+          <w:b w:val="false"/>
+          <w:bCs w:val="false"/>
+          <w:i w:val="false"/>
+          <w:iCs w:val="false"/>
+          <w:color w:val="1F2937"/>
+          <w:sz w:val="21"/>
+          <w:szCs w:val="21"/>
+        </w:rPr>
+        <w:t xml:space="preserve">Para que esto sea posible, los módulos de la oración simple, la oración compuesta, los sintagmas, el Arcade, Chispa y el análisis morfológico leen sus ejercicios de bancos locales incorporados a la propia aplicación —165 oraciones simples, 80 oraciones compuestas y 88 textos morfológicos, seleccionados del banco general y exportados a ficheros de datos—, y una bandera única de edición hace que el código sepa en qué edición está y se comporte en consecuencia: el inicio de sesión no exige correo, las referencias a la prueba de acceso de la Región de Murcia se expresan de forma neutra y los dos módulos de manipulación (Laboratorio y Fábrica) se anuncian como próximos.</w:t>
+      </w:r>
+    </w:p>
+    <w:p>
+      <w:pPr>
+        <w:spacing w:after="140" w:line="300"/>
+        <w:jc w:val="both"/>
+      </w:pPr>
+      <w:r>
+        <w:rPr>
+          <w:rFonts w:ascii="Georgia" w:cs="Georgia" w:eastAsia="Georgia" w:hAnsi="Georgia"/>
+          <w:b w:val="false"/>
+          <w:bCs w:val="false"/>
+          <w:i w:val="false"/>
+          <w:iCs w:val="false"/>
+          <w:color w:val="1F2937"/>
+          <w:sz w:val="21"/>
+          <w:szCs w:val="21"/>
+        </w:rPr>
+        <w:t xml:space="preserve">El constructor trabaja por lista blanca —solo se publica lo que figura expresamente en ella—, elimina del todo el código y el marcado del panel del profesor, sustituye la dirección del servidor por una nula, retira la marca de no indexación que lleva la edición completa y genera los ficheros de descubrimiento para buscadores (robots.txt, sitemap.xml) y los metadatos de presentación en redes. La edición completa y la ligera comparten así el cien por cien de la lógica didáctica y difieren únicamente en la capa de centro educativo. La edición ligera va acompañada de una guía de despliegue redactada para el técnico que la publique.</w:t>
+      </w:r>
+    </w:p>
+    <w:p>
+      <w:pPr>
+        <w:pStyle w:val="Heading2"/>
+        <w:spacing w:after="140" w:before="300"/>
+      </w:pPr>
+      <w:r>
+        <w:rPr>
+          <w:rFonts w:ascii="Georgia" w:cs="Georgia" w:eastAsia="Georgia" w:hAnsi="Georgia"/>
+          <w:b/>
+          <w:bCs/>
+          <w:color w:val="1F2937"/>
+          <w:sz w:val="23"/>
+          <w:szCs w:val="23"/>
+        </w:rPr>
+        <w:t xml:space="preserve">2.11 Otras mejoras funcionales</w:t>
       </w:r>
     </w:p>
     <w:p>
@@ -4235,7 +4635,7 @@
           <w:sz w:val="21"/>
           <w:szCs w:val="21"/>
         </w:rPr>
-        <w:t xml:space="preserve">Perfil de alumno persistente entre sesiones y entre dispositivos.</w:t>
+        <w:t xml:space="preserve">Aviso legal y política de privacidad propios, enlazados desde la pantalla de inicio de la aplicación. La política describe qué datos trata la edición ligera —ninguno sale del dispositivo del usuario—, con qué finalidad, con qué base legal y cómo borrarlos, y anuncia la ampliación específica que acompañará a la edición de centro.</w:t>
       </w:r>
     </w:p>
     <w:p>
@@ -4255,7 +4655,7 @@
           <w:sz w:val="21"/>
           <w:szCs w:val="21"/>
         </w:rPr>
-        <w:t xml:space="preserve">Glosario de términos gramaticales con etiquetado propio, accesible desde cualquier módulo.</w:t>
+        <w:t xml:space="preserve">Perfil de alumno persistente entre sesiones y entre dispositivos.</w:t>
       </w:r>
     </w:p>
     <w:p>
@@ -4275,7 +4675,7 @@
           <w:sz w:val="21"/>
           <w:szCs w:val="21"/>
         </w:rPr>
-        <w:t xml:space="preserve">Retos guiados y preguntas de reflexión metalingüística integrados en el flujo de práctica.</w:t>
+        <w:t xml:space="preserve">Glosario de términos gramaticales con etiquetado propio, accesible desde cualquier módulo.</w:t>
       </w:r>
     </w:p>
     <w:p>
@@ -4295,7 +4695,67 @@
           <w:sz w:val="21"/>
           <w:szCs w:val="21"/>
         </w:rPr>
+        <w:t xml:space="preserve">Retos guiados y preguntas de reflexión metalingüística integrados en el flujo de práctica.</w:t>
+      </w:r>
+    </w:p>
+    <w:p>
+      <w:pPr>
+        <w:pStyle w:val="ListParagraph"/>
+        <w:numPr>
+          <w:ilvl w:val="0"/>
+          <w:numId w:val="2"/>
+        </w:numPr>
+        <w:spacing w:after="90" w:line="290"/>
+        <w:jc w:val="both"/>
+      </w:pPr>
+      <w:r>
+        <w:rPr>
+          <w:rFonts w:ascii="Georgia" w:cs="Georgia" w:eastAsia="Georgia" w:hAnsi="Georgia"/>
+          <w:color w:val="1F2937"/>
+          <w:sz w:val="21"/>
+          <w:szCs w:val="21"/>
+        </w:rPr>
         <w:t xml:space="preserve">Refuerzo de la seguridad y la integridad de los datos del alumnado, detallado en el apartado 5.5.</w:t>
+      </w:r>
+    </w:p>
+    <w:p>
+      <w:pPr>
+        <w:pStyle w:val="ListParagraph"/>
+        <w:numPr>
+          <w:ilvl w:val="0"/>
+          <w:numId w:val="2"/>
+        </w:numPr>
+        <w:spacing w:after="90" w:line="290"/>
+        <w:jc w:val="both"/>
+      </w:pPr>
+      <w:r>
+        <w:rPr>
+          <w:rFonts w:ascii="Georgia" w:cs="Georgia" w:eastAsia="Georgia" w:hAnsi="Georgia"/>
+          <w:color w:val="1F2937"/>
+          <w:sz w:val="21"/>
+          <w:szCs w:val="21"/>
+        </w:rPr>
+        <w:t xml:space="preserve">Auditoría de los filtros de contenido del panel del profesor: el clasificador del tipo de verbo y el detector de funciones presentes en cada oración se han revisado para que los exámenes generados contengan exactamente las funciones que el profesor pide, y el filtro de subtipo del módulo de compuestas considera todos los subtipos que aparecen en un ejercicio y no solo el primero.</w:t>
+      </w:r>
+    </w:p>
+    <w:p>
+      <w:pPr>
+        <w:pStyle w:val="ListParagraph"/>
+        <w:numPr>
+          <w:ilvl w:val="0"/>
+          <w:numId w:val="2"/>
+        </w:numPr>
+        <w:spacing w:after="90" w:line="290"/>
+        <w:jc w:val="both"/>
+      </w:pPr>
+      <w:r>
+        <w:rPr>
+          <w:rFonts w:ascii="Georgia" w:cs="Georgia" w:eastAsia="Georgia" w:hAnsi="Georgia"/>
+          <w:color w:val="1F2937"/>
+          <w:sz w:val="21"/>
+          <w:szCs w:val="21"/>
+        </w:rPr>
+        <w:t xml:space="preserve">Manuales del profesor y del alumno revisados por completo contra el estado real de la aplicación.</w:t>
       </w:r>
     </w:p>
     <w:p>
@@ -5587,7 +6047,7 @@
           <w:sz w:val="21"/>
           <w:szCs w:val="21"/>
         </w:rPr>
-        <w:t xml:space="preserve">El programa consta, en su versión vigente, de más de cuarenta y seis mil líneas de código fuente propio, repartidas del siguiente modo:</w:t>
+        <w:t xml:space="preserve">El programa consta, en su versión vigente, de más de cuarenta y seis mil setecientas líneas de código fuente propio, repartidas del siguiente modo:</w:t>
       </w:r>
     </w:p>
     <w:tbl>
@@ -5722,7 +6182,7 @@
                 <w:sz w:val="19"/>
                 <w:szCs w:val="19"/>
               </w:rPr>
-              <w:t xml:space="preserve">25.025 líneas en más de 50 módulos</w:t>
+              <w:t xml:space="preserve">25.791 líneas en 51 módulos</w:t>
             </w:r>
           </w:p>
         </w:tc>
@@ -5781,7 +6241,7 @@
                 <w:sz w:val="19"/>
                 <w:szCs w:val="19"/>
               </w:rPr>
-              <w:t xml:space="preserve">10.502 líneas en 13 ficheros</w:t>
+              <w:t xml:space="preserve">10.562 líneas en 13 ficheros</w:t>
             </w:r>
           </w:p>
         </w:tc>
@@ -5840,7 +6300,7 @@
                 <w:sz w:val="19"/>
                 <w:szCs w:val="19"/>
               </w:rPr>
-              <w:t xml:space="preserve">6.765 líneas</w:t>
+              <w:t xml:space="preserve">6.767 líneas</w:t>
             </w:r>
           </w:p>
         </w:tc>
@@ -5872,7 +6332,7 @@
                 <w:sz w:val="19"/>
                 <w:szCs w:val="19"/>
               </w:rPr>
-              <w:t xml:space="preserve">Interfaz y manuales (HTML)</w:t>
+              <w:t xml:space="preserve">Interfaz, manuales y textos legales (HTML)</w:t>
             </w:r>
           </w:p>
         </w:tc>
@@ -5899,7 +6359,7 @@
                 <w:sz w:val="19"/>
                 <w:szCs w:val="19"/>
               </w:rPr>
-              <w:t xml:space="preserve">3.445 líneas</w:t>
+              <w:t xml:space="preserve">3.440 líneas</w:t>
             </w:r>
           </w:p>
         </w:tc>
@@ -5990,6 +6450,65 @@
                 <w:sz w:val="19"/>
                 <w:szCs w:val="19"/>
               </w:rPr>
+              <w:t xml:space="preserve">Constructor de la edición ligera</w:t>
+            </w:r>
+          </w:p>
+        </w:tc>
+        <w:tc>
+          <w:tcPr>
+            <w:tcW w:type="dxa" w:w="4278"/>
+            <w:tcMar>
+              <w:top w:type="dxa" w:w="90"/>
+              <w:left w:type="dxa" w:w="130"/>
+              <w:bottom w:type="dxa" w:w="90"/>
+              <w:right w:type="dxa" w:w="130"/>
+            </w:tcMar>
+          </w:tcPr>
+          <w:p>
+            <w:pPr>
+              <w:spacing w:after="0" w:line="260"/>
+            </w:pPr>
+            <w:r>
+              <w:rPr>
+                <w:rFonts w:ascii="Georgia" w:cs="Georgia" w:eastAsia="Georgia" w:hAnsi="Georgia"/>
+                <w:b w:val="false"/>
+                <w:bCs w:val="false"/>
+                <w:color w:val="1F2937"/>
+                <w:sz w:val="19"/>
+                <w:szCs w:val="19"/>
+              </w:rPr>
+              <w:t xml:space="preserve">204 líneas</w:t>
+            </w:r>
+          </w:p>
+        </w:tc>
+      </w:tr>
+      <w:tr>
+        <w:trPr>
+          <w:tblHeader w:val="false"/>
+        </w:trPr>
+        <w:tc>
+          <w:tcPr>
+            <w:tcW w:type="dxa" w:w="5228"/>
+            <w:tcMar>
+              <w:top w:type="dxa" w:w="90"/>
+              <w:left w:type="dxa" w:w="130"/>
+              <w:bottom w:type="dxa" w:w="90"/>
+              <w:right w:type="dxa" w:w="130"/>
+            </w:tcMar>
+          </w:tcPr>
+          <w:p>
+            <w:pPr>
+              <w:spacing w:after="0" w:line="260"/>
+            </w:pPr>
+            <w:r>
+              <w:rPr>
+                <w:rFonts w:ascii="Georgia" w:cs="Georgia" w:eastAsia="Georgia" w:hAnsi="Georgia"/>
+                <w:b w:val="false"/>
+                <w:bCs w:val="false"/>
+                <w:color w:val="1F2937"/>
+                <w:sz w:val="19"/>
+                <w:szCs w:val="19"/>
+              </w:rPr>
               <w:t xml:space="preserve">TOTAL DE CÓDIGO FUENTE PROPIO</w:t>
             </w:r>
           </w:p>
@@ -6017,7 +6536,7 @@
                 <w:sz w:val="19"/>
                 <w:szCs w:val="19"/>
               </w:rPr>
-              <w:t xml:space="preserve">Más de 45.900 líneas, sin contar la documentación técnica ni los bancos de datos</w:t>
+              <w:t xml:space="preserve">Más de 46.900 líneas, sin contar la documentación técnica ni los bancos de datos</w:t>
             </w:r>
           </w:p>
         </w:tc>
@@ -6039,7 +6558,7 @@
           <w:sz w:val="21"/>
           <w:szCs w:val="21"/>
         </w:rPr>
-        <w:t xml:space="preserve">Los módulos didácticos de mayor extensión son el de la oración compuesta (5.658 líneas), el de la oración simple (4.186), el Laboratorio de Oraciones (1.878), la Fábrica de Palabras (1.652), el panel del profesor (1.646, más 968 de su generador de informes), la morfología (1.388) y el Arcade (1.141).</w:t>
+        <w:t xml:space="preserve">Los módulos didácticos de mayor extensión son el de la oración compuesta (5.817 líneas), el de la oración simple (4.366), el Laboratorio de Oraciones (1.878), el panel del profesor (1.688, más 1.027 de su generador de informes), la Fábrica de Palabras (1.652), la morfología (1.453) y el Arcade (1.135).</w:t>
       </w:r>
     </w:p>
     <w:p>
@@ -6076,6 +6595,61 @@
           <w:szCs w:val="21"/>
         </w:rPr>
         <w:t xml:space="preserve">Es una seña de identidad de la obra su práctica ausencia de dependencias externas. No emplea ningún marco de trabajo (React, Vue, Angular), ninguna biblioteca de terceros para su lógica, ningún empaquetador, ningún preprocesador y ningún lenguaje transpilado. Se apoya exclusivamente en las interfaces de programación nativas del navegador: módulos ES6, Web Audio API para el sonido generado por síntesis, almacenamiento local para la persistencia de cliente, Service Worker para el funcionamiento sin conexión y las funciones de red estándar. La única biblioteca de terceros utilizada —la que escribe los ficheros de hoja de cálculo del informe del profesor— está incorporada al propio repositorio con licencia libre, en lugar de cargarse desde un servidor ajeno, precisamente para que la obra no dependa de nadie.</w:t>
+      </w:r>
+    </w:p>
+    <w:p>
+      <w:pPr>
+        <w:pStyle w:val="Heading2"/>
+        <w:spacing w:after="140" w:before="300"/>
+      </w:pPr>
+      <w:r>
+        <w:rPr>
+          <w:rFonts w:ascii="Georgia" w:cs="Georgia" w:eastAsia="Georgia" w:hAnsi="Georgia"/>
+          <w:b/>
+          <w:bCs/>
+          <w:color w:val="1F2937"/>
+          <w:sz w:val="23"/>
+          <w:szCs w:val="23"/>
+        </w:rPr>
+        <w:t xml:space="preserve">3.6 Una sola fuente, dos ediciones</w:t>
+      </w:r>
+    </w:p>
+    <w:p>
+      <w:pPr>
+        <w:spacing w:after="140" w:line="300"/>
+        <w:jc w:val="both"/>
+      </w:pPr>
+      <w:r>
+        <w:rPr>
+          <w:rFonts w:ascii="Georgia" w:cs="Georgia" w:eastAsia="Georgia" w:hAnsi="Georgia"/>
+          <w:b w:val="false"/>
+          <w:bCs w:val="false"/>
+          <w:i w:val="false"/>
+          <w:iCs w:val="false"/>
+          <w:color w:val="1F2937"/>
+          <w:sz w:val="21"/>
+          <w:szCs w:val="21"/>
+        </w:rPr>
+        <w:t xml:space="preserve">La edición ligera no es una copia mantenida aparte, sino el resultado de una transformación automática del código fuente único. Un constructor propio lee el repositorio y escribe en una carpeta independiente la copia publicable, aplicando en el camino un conjunto cerrado de ajustes: activa la bandera de edición, vacía la dirección del servidor, excluye por completo el módulo del panel del profesor y su marcado, retira la biblioteca de hojas de cálculo que solo ese panel necesita, elimina la marca de no indexación y genera los ficheros de descubrimiento y los metadatos de presentación. Al terminar, el constructor verifica cada una de esas condiciones sobre el resultado y se niega a dar por buena la copia si alguna falla.</w:t>
+      </w:r>
+    </w:p>
+    <w:p>
+      <w:pPr>
+        <w:spacing w:after="140" w:line="300"/>
+        <w:jc w:val="both"/>
+      </w:pPr>
+      <w:r>
+        <w:rPr>
+          <w:rFonts w:ascii="Georgia" w:cs="Georgia" w:eastAsia="Georgia" w:hAnsi="Georgia"/>
+          <w:b w:val="false"/>
+          <w:bCs w:val="false"/>
+          <w:i w:val="false"/>
+          <w:iCs w:val="false"/>
+          <w:color w:val="1F2937"/>
+          <w:sz w:val="21"/>
+          <w:szCs w:val="21"/>
+        </w:rPr>
+        <w:t xml:space="preserve">El código didáctico no se toca: son los propios módulos los que, al consultar la bandera de edición, deciden si leen los ejercicios del servidor o de los bancos locales, si exigen correo en el inicio de sesión o si muestran u ocultan el modo examen. De este modo cualquier mejora del motor pedagógico llega a las dos ediciones con una sola escritura, y la diferencia entre ambas queda reducida, de forma verificable, a la capa de centro educativo.</w:t>
       </w:r>
     </w:p>
     <w:p>
@@ -8588,7 +9162,7 @@
                 <w:sz w:val="19"/>
                 <w:szCs w:val="19"/>
               </w:rPr>
-              <w:t xml:space="preserve">Textos explicativos propios asociados a cada tipo de error, con pistas contextuales graduadas, en los módulos de simples, compuestas, sintagmas, morfología, Laboratorio y Fábrica.</w:t>
+              <w:t xml:space="preserve">Textos explicativos propios asociados a cada tipo de error, con pistas contextuales graduadas, en los módulos de simples, compuestas, sintagmas, morfología, Laboratorio y Fábrica. Incluye la micro-lección «El verbo que se vació», sobre los verbos semicopulativos, con sus tres pruebas y sus tres familias.</w:t>
             </w:r>
           </w:p>
         </w:tc>
@@ -8647,7 +9221,7 @@
                 <w:sz w:val="19"/>
                 <w:szCs w:val="19"/>
               </w:rPr>
-              <w:t xml:space="preserve">Los pasos de análisis (simple, compuesta, sintagma), las cascadas morfológicas y las tres estaciones de los módulos nuevos, como itinerario didáctico.</w:t>
+              <w:t xml:space="preserve">Los pasos de análisis (simple, compuesta, sintagma), la decisión en dos tiempos del tipo de predicado, las cascadas morfológicas y las tres estaciones de los módulos nuevos, como itinerario didáctico.</w:t>
             </w:r>
           </w:p>
         </w:tc>
@@ -8706,7 +9280,7 @@
                 <w:sz w:val="19"/>
                 <w:szCs w:val="19"/>
               </w:rPr>
-              <w:t xml:space="preserve">Más de 650 oraciones simples analizadas, el banco de oración compuesta y los corpus morfológicos de los tres niveles, todos de elaboración propia.</w:t>
+              <w:t xml:space="preserve">Más de 650 oraciones simples analizadas —entre ellas un subconjunto revisado de dieciséis con verbo semicopulativo—, el banco de oración compuesta y los corpus morfológicos de los tres niveles, todos de elaboración propia, además de la selección exportada a los bancos locales de la edición ligera (165 simples, 80 compuestas y 88 textos morfológicos).</w:t>
             </w:r>
           </w:p>
         </w:tc>
@@ -9039,7 +9613,7 @@
                 <w:sz w:val="19"/>
                 <w:szCs w:val="19"/>
               </w:rPr>
-              <w:t xml:space="preserve">Más de 50 módulos de JavaScript ES6 (25.025 líneas), el documento de pantallas y los manuales en HTML (3.445 líneas), las hojas de estilo (6.765 líneas) y el armazón sin conexión (192 líneas).</w:t>
+              <w:t xml:space="preserve">51 módulos de JavaScript ES6 (25.791 líneas), el documento de pantallas, los manuales y los textos legales en HTML (3.440 líneas), las hojas de estilo (6.767 líneas) y el armazón sin conexión (192 líneas).</w:t>
             </w:r>
           </w:p>
         </w:tc>
@@ -9098,7 +9672,7 @@
                 <w:sz w:val="19"/>
                 <w:szCs w:val="19"/>
               </w:rPr>
-              <w:t xml:space="preserve">Trece ficheros de Google Apps Script (10.502 líneas): núcleo, compuestas, Laboratorio, Fábrica, informes, envío de correo y analíticas.</w:t>
+              <w:t xml:space="preserve">Trece ficheros de Google Apps Script (10.562 líneas): núcleo, compuestas, Laboratorio, Fábrica, informes, envío de correo y analíticas.</w:t>
             </w:r>
           </w:p>
         </w:tc>
@@ -9130,7 +9704,7 @@
                 <w:sz w:val="19"/>
                 <w:szCs w:val="19"/>
               </w:rPr>
-              <w:t xml:space="preserve">Base de datos estructurada</w:t>
+              <w:t xml:space="preserve">Edición ligera y su constructor</w:t>
             </w:r>
           </w:p>
         </w:tc>
@@ -9157,7 +9731,7 @@
                 <w:sz w:val="19"/>
                 <w:szCs w:val="19"/>
               </w:rPr>
-              <w:t xml:space="preserve">Exportación de la hoja de cálculo con sus hojas de bancos, configuraciones, resultados, rankings y analíticas.</w:t>
+              <w:t xml:space="preserve">El constructor que genera la edición ligera a partir del código fuente único (204 líneas), la copia generada, los bancos locales de datos que la alimentan y la guía de despliegue para el técnico que la publique.</w:t>
             </w:r>
           </w:p>
         </w:tc>
@@ -9189,6 +9763,65 @@
                 <w:sz w:val="19"/>
                 <w:szCs w:val="19"/>
               </w:rPr>
+              <w:t xml:space="preserve">Base de datos estructurada</w:t>
+            </w:r>
+          </w:p>
+        </w:tc>
+        <w:tc>
+          <w:tcPr>
+            <w:tcW w:type="dxa" w:w="6654"/>
+            <w:tcMar>
+              <w:top w:type="dxa" w:w="90"/>
+              <w:left w:type="dxa" w:w="130"/>
+              <w:bottom w:type="dxa" w:w="90"/>
+              <w:right w:type="dxa" w:w="130"/>
+            </w:tcMar>
+          </w:tcPr>
+          <w:p>
+            <w:pPr>
+              <w:spacing w:after="0" w:line="260"/>
+            </w:pPr>
+            <w:r>
+              <w:rPr>
+                <w:rFonts w:ascii="Georgia" w:cs="Georgia" w:eastAsia="Georgia" w:hAnsi="Georgia"/>
+                <w:b w:val="false"/>
+                <w:bCs w:val="false"/>
+                <w:color w:val="1F2937"/>
+                <w:sz w:val="19"/>
+                <w:szCs w:val="19"/>
+              </w:rPr>
+              <w:t xml:space="preserve">Exportación de la hoja de cálculo con sus hojas de bancos, configuraciones, resultados, rankings y analíticas.</w:t>
+            </w:r>
+          </w:p>
+        </w:tc>
+      </w:tr>
+      <w:tr>
+        <w:trPr>
+          <w:tblHeader w:val="false"/>
+        </w:trPr>
+        <w:tc>
+          <w:tcPr>
+            <w:tcW w:type="dxa" w:w="2852"/>
+            <w:tcMar>
+              <w:top w:type="dxa" w:w="90"/>
+              <w:left w:type="dxa" w:w="130"/>
+              <w:bottom w:type="dxa" w:w="90"/>
+              <w:right w:type="dxa" w:w="130"/>
+            </w:tcMar>
+          </w:tcPr>
+          <w:p>
+            <w:pPr>
+              <w:spacing w:after="0" w:line="260"/>
+            </w:pPr>
+            <w:r>
+              <w:rPr>
+                <w:rFonts w:ascii="Georgia" w:cs="Georgia" w:eastAsia="Georgia" w:hAnsi="Georgia"/>
+                <w:b w:val="false"/>
+                <w:bCs w:val="false"/>
+                <w:color w:val="1F2937"/>
+                <w:sz w:val="19"/>
+                <w:szCs w:val="19"/>
+              </w:rPr>
               <w:t xml:space="preserve">Bancos de contenido propios</w:t>
             </w:r>
           </w:p>
@@ -9216,7 +9849,7 @@
                 <w:sz w:val="19"/>
                 <w:szCs w:val="19"/>
               </w:rPr>
-              <w:t xml:space="preserve">Más de 650 oraciones simples analizadas, el banco de oración compuesta, los corpus morfológicos de tres niveles, cerca de 210 retos del Laboratorio y 122 retos de la Fábrica.</w:t>
+              <w:t xml:space="preserve">Más de 650 oraciones simples analizadas, el banco de oración compuesta, los corpus morfológicos de tres niveles, cerca de 210 retos del Laboratorio, 122 retos de la Fábrica y los tres bancos locales de la edición ligera.</w:t>
             </w:r>
           </w:p>
         </w:tc>
@@ -10171,7 +10804,7 @@
                 <w:sz w:val="19"/>
                 <w:szCs w:val="19"/>
               </w:rPr>
-              <w:t xml:space="preserve">Agosto 2026</w:t>
+              <w:t xml:space="preserve">Agosto – septiembre 2026</w:t>
             </w:r>
           </w:p>
         </w:tc>
@@ -10198,7 +10831,7 @@
                 <w:sz w:val="19"/>
                 <w:szCs w:val="19"/>
               </w:rPr>
-              <w:t xml:space="preserve">El Laboratorio de Oraciones y La Fábrica de Palabras (módulos nuevos). Cuadernos independientes por profesor. Calificación verificada en servidor con vale de un solo uso. Funcionamiento sin conexión y arranque resistente. Versión objeto de esta ampliación.</w:t>
+              <w:t xml:space="preserve">El Laboratorio de Oraciones y La Fábrica de Palabras (módulos nuevos). Cuadernos independientes por profesor. Calificación verificada en servidor con vale de un solo uso. Funcionamiento sin conexión y arranque resistente. Edición ligera sin servidor generada desde el mismo código. Tratamiento de los verbos semicopulativos. Aviso legal y política de privacidad. Versión objeto de esta ampliación.</w:t>
             </w:r>
           </w:p>
         </w:tc>
@@ -10631,7 +11264,7 @@
           <w:sz w:val="21"/>
           <w:szCs w:val="21"/>
         </w:rPr>
-        <w:t xml:space="preserve">css/tokens.css, css/legacy.css, css/theme/new-ui.css — hojas de estilo.</w:t>
+        <w:t xml:space="preserve">aviso-legal.html, privacidad.html — aviso legal y política de privacidad.</w:t>
       </w:r>
     </w:p>
     <w:p>
@@ -10651,24 +11284,7 @@
           <w:sz w:val="21"/>
           <w:szCs w:val="21"/>
         </w:rPr>
-        <w:t xml:space="preserve">sw.js, manifest.json — armazón de funcionamiento sin conexión.</w:t>
-      </w:r>
-    </w:p>
-    <w:p>
-      <w:pPr>
-        <w:pStyle w:val="Heading2"/>
-        <w:spacing w:after="140" w:before="300"/>
-      </w:pPr>
-      <w:r>
-        <w:rPr>
-          <w:rFonts w:ascii="Georgia" w:cs="Georgia" w:eastAsia="Georgia" w:hAnsi="Georgia"/>
-          <w:b/>
-          <w:bCs/>
-          <w:color w:val="1F2937"/>
-          <w:sz w:val="23"/>
-          <w:szCs w:val="23"/>
-        </w:rPr>
-        <w:t xml:space="preserve">Módulos didácticos (js/modules)</w:t>
+        <w:t xml:space="preserve">css/tokens.css, css/legacy.css, css/theme/new-ui.css — hojas de estilo.</w:t>
       </w:r>
     </w:p>
     <w:p>
@@ -10688,7 +11304,24 @@
           <w:sz w:val="21"/>
           <w:szCs w:val="21"/>
         </w:rPr>
-        <w:t xml:space="preserve">sint/index.js — motor de la oración simple.</w:t>
+        <w:t xml:space="preserve">sw.js, manifest.json — armazón de funcionamiento sin conexión.</w:t>
+      </w:r>
+    </w:p>
+    <w:p>
+      <w:pPr>
+        <w:pStyle w:val="Heading2"/>
+        <w:spacing w:after="140" w:before="300"/>
+      </w:pPr>
+      <w:r>
+        <w:rPr>
+          <w:rFonts w:ascii="Georgia" w:cs="Georgia" w:eastAsia="Georgia" w:hAnsi="Georgia"/>
+          <w:b/>
+          <w:bCs/>
+          <w:color w:val="1F2937"/>
+          <w:sz w:val="23"/>
+          <w:szCs w:val="23"/>
+        </w:rPr>
+        <w:t xml:space="preserve">Edición ligera</w:t>
       </w:r>
     </w:p>
     <w:p>
@@ -10708,7 +11341,7 @@
           <w:sz w:val="21"/>
           <w:szCs w:val="21"/>
         </w:rPr>
-        <w:t xml:space="preserve">compuestas/index.js — motor de la oración compuesta.</w:t>
+        <w:t xml:space="preserve">build-light.js — constructor que genera la edición ligera a partir del código fuente único.</w:t>
       </w:r>
     </w:p>
     <w:p>
@@ -10728,7 +11361,7 @@
           <w:sz w:val="21"/>
           <w:szCs w:val="21"/>
         </w:rPr>
-        <w:t xml:space="preserve">maestro/index.js — análisis morfológico en tres niveles.</w:t>
+        <w:t xml:space="preserve">data/banco-simple.json, data/banco-compuestas.json, data/banco-morfologia.json — bancos locales que alimentan la edición ligera.</w:t>
       </w:r>
     </w:p>
     <w:p>
@@ -10748,7 +11381,7 @@
           <w:sz w:val="21"/>
           <w:szCs w:val="21"/>
         </w:rPr>
-        <w:t xml:space="preserve">sintagmas/index.js — análisis de la estructura del sintagma.</w:t>
+        <w:t xml:space="preserve">dist-light/ — copia de la edición ligera tal como se publica (aplicación, robots.txt y sitemap.xml), regenerable en cualquier momento con el constructor.</w:t>
       </w:r>
     </w:p>
     <w:p>
@@ -10768,7 +11401,24 @@
           <w:sz w:val="21"/>
           <w:szCs w:val="21"/>
         </w:rPr>
-        <w:t xml:space="preserve">laboratorio/index.js — Laboratorio de Oraciones.</w:t>
+        <w:t xml:space="preserve">Traspaso_Informatico.md — guía de despliegue de la edición ligera.</w:t>
+      </w:r>
+    </w:p>
+    <w:p>
+      <w:pPr>
+        <w:pStyle w:val="Heading2"/>
+        <w:spacing w:after="140" w:before="300"/>
+      </w:pPr>
+      <w:r>
+        <w:rPr>
+          <w:rFonts w:ascii="Georgia" w:cs="Georgia" w:eastAsia="Georgia" w:hAnsi="Georgia"/>
+          <w:b/>
+          <w:bCs/>
+          <w:color w:val="1F2937"/>
+          <w:sz w:val="23"/>
+          <w:szCs w:val="23"/>
+        </w:rPr>
+        <w:t xml:space="preserve">Módulos didácticos (js/modules)</w:t>
       </w:r>
     </w:p>
     <w:p>
@@ -10788,7 +11438,7 @@
           <w:sz w:val="21"/>
           <w:szCs w:val="21"/>
         </w:rPr>
-        <w:t xml:space="preserve">fabrica/index.js — Fábrica de Palabras.</w:t>
+        <w:t xml:space="preserve">sint/index.js — motor de la oración simple.</w:t>
       </w:r>
     </w:p>
     <w:p>
@@ -10808,7 +11458,7 @@
           <w:sz w:val="21"/>
           <w:szCs w:val="21"/>
         </w:rPr>
-        <w:t xml:space="preserve">chispa/index.js — identificación rápida de funciones.</w:t>
+        <w:t xml:space="preserve">compuestas/index.js — motor de la oración compuesta.</w:t>
       </w:r>
     </w:p>
     <w:p>
@@ -10828,7 +11478,7 @@
           <w:sz w:val="21"/>
           <w:szCs w:val="21"/>
         </w:rPr>
-        <w:t xml:space="preserve">arcade/index.js — práctica gamificada con cuatro submodalidades.</w:t>
+        <w:t xml:space="preserve">maestro/index.js — análisis morfológico en tres niveles.</w:t>
       </w:r>
     </w:p>
     <w:p>
@@ -10848,7 +11498,7 @@
           <w:sz w:val="21"/>
           <w:szCs w:val="21"/>
         </w:rPr>
-        <w:t xml:space="preserve">teacher/index.js e informe-excel.js — panel del profesor e informes.</w:t>
+        <w:t xml:space="preserve">sintagmas/index.js — análisis de la estructura del sintagma.</w:t>
       </w:r>
     </w:p>
     <w:p>
@@ -10868,24 +11518,7 @@
           <w:sz w:val="21"/>
           <w:szCs w:val="21"/>
         </w:rPr>
-        <w:t xml:space="preserve">app.js — punto de entrada que integra todos los módulos.</w:t>
-      </w:r>
-    </w:p>
-    <w:p>
-      <w:pPr>
-        <w:pStyle w:val="Heading2"/>
-        <w:spacing w:after="140" w:before="300"/>
-      </w:pPr>
-      <w:r>
-        <w:rPr>
-          <w:rFonts w:ascii="Georgia" w:cs="Georgia" w:eastAsia="Georgia" w:hAnsi="Georgia"/>
-          <w:b/>
-          <w:bCs/>
-          <w:color w:val="1F2937"/>
-          <w:sz w:val="23"/>
-          <w:szCs w:val="23"/>
-        </w:rPr>
-        <w:t xml:space="preserve">Núcleo de servicios y datos (js/core, js/data, js/feedback, js/gamification, js/glosario)</w:t>
+        <w:t xml:space="preserve">laboratorio/index.js — Laboratorio de Oraciones.</w:t>
       </w:r>
     </w:p>
     <w:p>
@@ -10905,7 +11538,7 @@
           <w:sz w:val="21"/>
           <w:szCs w:val="21"/>
         </w:rPr>
-        <w:t xml:space="preserve">core/ — red, enrutado, perfil, almacenamiento, audio, autenticación, escapado, temporizadores y cuadernos de profesor.</w:t>
+        <w:t xml:space="preserve">fabrica/index.js — Fábrica de Palabras.</w:t>
       </w:r>
     </w:p>
     <w:p>
@@ -10925,7 +11558,7 @@
           <w:sz w:val="21"/>
           <w:szCs w:val="21"/>
         </w:rPr>
-        <w:t xml:space="preserve">data/ — cascadas morfológicas, canon de aceptabilidad, repertorios de pruebas de sintaxis y de morfología, diccionarios y corpus de respaldo.</w:t>
+        <w:t xml:space="preserve">chispa/index.js — identificación rápida de funciones.</w:t>
       </w:r>
     </w:p>
     <w:p>
@@ -10945,7 +11578,7 @@
           <w:sz w:val="21"/>
           <w:szCs w:val="21"/>
         </w:rPr>
-        <w:t xml:space="preserve">feedback/ — micro-lecciones, pistas contextuales y seguimiento del error por función.</w:t>
+        <w:t xml:space="preserve">arcade/index.js — práctica gamificada con cuatro submodalidades.</w:t>
       </w:r>
     </w:p>
     <w:p>
@@ -10965,7 +11598,7 @@
           <w:sz w:val="21"/>
           <w:szCs w:val="21"/>
         </w:rPr>
-        <w:t xml:space="preserve">gamification/ — experiencia, niveles, rachas, misiones y panel del alumno.</w:t>
+        <w:t xml:space="preserve">teacher/index.js e informe-excel.js — panel del profesor e informes.</w:t>
       </w:r>
     </w:p>
     <w:p>
@@ -10985,7 +11618,7 @@
           <w:sz w:val="21"/>
           <w:szCs w:val="21"/>
         </w:rPr>
-        <w:t xml:space="preserve">glosario/ — glosario de términos gramaticales y etiquetado de funciones.</w:t>
+        <w:t xml:space="preserve">app.js — punto de entrada que integra todos los módulos.</w:t>
       </w:r>
     </w:p>
     <w:p>
@@ -11002,7 +11635,7 @@
           <w:sz w:val="23"/>
           <w:szCs w:val="23"/>
         </w:rPr>
-        <w:t xml:space="preserve">Backend (Google Apps Script)</w:t>
+        <w:t xml:space="preserve">Núcleo de servicios y datos (js/core, js/data, js/feedback, js/gamification, js/glosario)</w:t>
       </w:r>
     </w:p>
     <w:p>
@@ -11022,7 +11655,7 @@
           <w:sz w:val="21"/>
           <w:szCs w:val="21"/>
         </w:rPr>
-        <w:t xml:space="preserve">Code_v6.gs — backend principal.</w:t>
+        <w:t xml:space="preserve">core/ — red, enrutado, perfil, almacenamiento, audio, autenticación, escapado, temporizadores y cuadernos de profesor.</w:t>
       </w:r>
     </w:p>
     <w:p>
@@ -11042,7 +11675,7 @@
           <w:sz w:val="21"/>
           <w:szCs w:val="21"/>
         </w:rPr>
-        <w:t xml:space="preserve">Compuestas.gs, Laboratorio.gs, Formacion.gs — backends de los módulos con banco propio.</w:t>
+        <w:t xml:space="preserve">data/ — cascadas morfológicas, canon de aceptabilidad, repertorios de pruebas de sintaxis y de morfología, diccionarios y corpus de respaldo.</w:t>
       </w:r>
     </w:p>
     <w:p>
@@ -11062,7 +11695,7 @@
           <w:sz w:val="21"/>
           <w:szCs w:val="21"/>
         </w:rPr>
-        <w:t xml:space="preserve">ChispaStats.gs — analíticas del modo Chispa.</w:t>
+        <w:t xml:space="preserve">feedback/ — micro-lecciones, pistas contextuales y seguimiento del error por función.</w:t>
       </w:r>
     </w:p>
     <w:p>
@@ -11082,24 +11715,7 @@
           <w:sz w:val="21"/>
           <w:szCs w:val="21"/>
         </w:rPr>
-        <w:t xml:space="preserve">InformeExamen.gs, FormatoResultados.gs, Minigraficos.gs, TablaGrupos.gs, AnaliticaEvolutiva.gs, EvolucionAlumnos.gs, EnviarInformes.gs — informes, analíticas y envío de calificaciones.</w:t>
-      </w:r>
-    </w:p>
-    <w:p>
-      <w:pPr>
-        <w:pStyle w:val="Heading2"/>
-        <w:spacing w:after="140" w:before="300"/>
-      </w:pPr>
-      <w:r>
-        <w:rPr>
-          <w:rFonts w:ascii="Georgia" w:cs="Georgia" w:eastAsia="Georgia" w:hAnsi="Georgia"/>
-          <w:b/>
-          <w:bCs/>
-          <w:color w:val="1F2937"/>
-          <w:sz w:val="23"/>
-          <w:szCs w:val="23"/>
-        </w:rPr>
-        <w:t xml:space="preserve">Contenidos didácticos originales</w:t>
+        <w:t xml:space="preserve">gamification/ — experiencia, niveles, rachas, misiones y panel del alumno.</w:t>
       </w:r>
     </w:p>
     <w:p>
@@ -11119,7 +11735,24 @@
           <w:sz w:val="21"/>
           <w:szCs w:val="21"/>
         </w:rPr>
-        <w:t xml:space="preserve">Banco_reflexion_metalinguistica.md — banco de ítems de reflexión metalingüística.</w:t>
+        <w:t xml:space="preserve">glosario/ — glosario de términos gramaticales y etiquetado de funciones.</w:t>
+      </w:r>
+    </w:p>
+    <w:p>
+      <w:pPr>
+        <w:pStyle w:val="Heading2"/>
+        <w:spacing w:after="140" w:before="300"/>
+      </w:pPr>
+      <w:r>
+        <w:rPr>
+          <w:rFonts w:ascii="Georgia" w:cs="Georgia" w:eastAsia="Georgia" w:hAnsi="Georgia"/>
+          <w:b/>
+          <w:bCs/>
+          <w:color w:val="1F2937"/>
+          <w:sz w:val="23"/>
+          <w:szCs w:val="23"/>
+        </w:rPr>
+        <w:t xml:space="preserve">Backend (Google Apps Script)</w:t>
       </w:r>
     </w:p>
     <w:p>
@@ -11139,7 +11772,7 @@
           <w:sz w:val="21"/>
           <w:szCs w:val="21"/>
         </w:rPr>
-        <w:t xml:space="preserve">docs/Canon_Agramaticalidad_Laboratorio.md — canon de aceptabilidad del corpus agramatical.</w:t>
+        <w:t xml:space="preserve">Code_v6.gs — backend principal.</w:t>
       </w:r>
     </w:p>
     <w:p>
@@ -11159,7 +11792,7 @@
           <w:sz w:val="21"/>
           <w:szCs w:val="21"/>
         </w:rPr>
-        <w:t xml:space="preserve">docs/Cascada_Valores_del_SE_Laboratorio.md — diseño del ítem de investigación abierta.</w:t>
+        <w:t xml:space="preserve">Compuestas.gs, Laboratorio.gs, Formacion.gs — backends de los módulos con banco propio.</w:t>
       </w:r>
     </w:p>
     <w:p>
@@ -11179,7 +11812,7 @@
           <w:sz w:val="21"/>
           <w:szCs w:val="21"/>
         </w:rPr>
-        <w:t xml:space="preserve">docs/Schema_Laboratorio_v1.0.md, docs/Schema_Formacion_v1.0.md — esquemas normativos de los bancos nuevos.</w:t>
+        <w:t xml:space="preserve">ChispaStats.gs — analíticas del modo Chispa.</w:t>
       </w:r>
     </w:p>
     <w:p>
@@ -11199,7 +11832,24 @@
           <w:sz w:val="21"/>
           <w:szCs w:val="21"/>
         </w:rPr>
-        <w:t xml:space="preserve">docs/Laboratorio_Oraciones_Plan_Producto.md, docs/Fabrica_Palabras_Plan_Producto.md — planes de producto y especificación de los dos módulos nuevos.</w:t>
+        <w:t xml:space="preserve">InformeExamen.gs, FormatoResultados.gs, Minigraficos.gs, TablaGrupos.gs, AnaliticaEvolutiva.gs, EvolucionAlumnos.gs, EnviarInformes.gs — informes, analíticas y envío de calificaciones.</w:t>
+      </w:r>
+    </w:p>
+    <w:p>
+      <w:pPr>
+        <w:pStyle w:val="Heading2"/>
+        <w:spacing w:after="140" w:before="300"/>
+      </w:pPr>
+      <w:r>
+        <w:rPr>
+          <w:rFonts w:ascii="Georgia" w:cs="Georgia" w:eastAsia="Georgia" w:hAnsi="Georgia"/>
+          <w:b/>
+          <w:bCs/>
+          <w:color w:val="1F2937"/>
+          <w:sz w:val="23"/>
+          <w:szCs w:val="23"/>
+        </w:rPr>
+        <w:t xml:space="preserve">Contenidos didácticos originales</w:t>
       </w:r>
     </w:p>
     <w:p>
@@ -11219,7 +11869,7 @@
           <w:sz w:val="21"/>
           <w:szCs w:val="21"/>
         </w:rPr>
-        <w:t xml:space="preserve">docs/propuesta_niveles_morfologia.md — diseño del modelo morfológico en tres niveles.</w:t>
+        <w:t xml:space="preserve">Banco_reflexion_metalinguistica.md — banco de ítems de reflexión metalingüística.</w:t>
       </w:r>
     </w:p>
     <w:p>
@@ -11239,7 +11889,127 @@
           <w:sz w:val="21"/>
           <w:szCs w:val="21"/>
         </w:rPr>
+        <w:t xml:space="preserve">docs/Canon_Agramaticalidad_Laboratorio.md — canon de aceptabilidad del corpus agramatical.</w:t>
+      </w:r>
+    </w:p>
+    <w:p>
+      <w:pPr>
+        <w:pStyle w:val="ListParagraph"/>
+        <w:numPr>
+          <w:ilvl w:val="0"/>
+          <w:numId w:val="2"/>
+        </w:numPr>
+        <w:spacing w:after="90" w:line="290"/>
+        <w:jc w:val="both"/>
+      </w:pPr>
+      <w:r>
+        <w:rPr>
+          <w:rFonts w:ascii="Georgia" w:cs="Georgia" w:eastAsia="Georgia" w:hAnsi="Georgia"/>
+          <w:color w:val="1F2937"/>
+          <w:sz w:val="21"/>
+          <w:szCs w:val="21"/>
+        </w:rPr>
+        <w:t xml:space="preserve">docs/Cascada_Valores_del_SE_Laboratorio.md — diseño del ítem de investigación abierta.</w:t>
+      </w:r>
+    </w:p>
+    <w:p>
+      <w:pPr>
+        <w:pStyle w:val="ListParagraph"/>
+        <w:numPr>
+          <w:ilvl w:val="0"/>
+          <w:numId w:val="2"/>
+        </w:numPr>
+        <w:spacing w:after="90" w:line="290"/>
+        <w:jc w:val="both"/>
+      </w:pPr>
+      <w:r>
+        <w:rPr>
+          <w:rFonts w:ascii="Georgia" w:cs="Georgia" w:eastAsia="Georgia" w:hAnsi="Georgia"/>
+          <w:color w:val="1F2937"/>
+          <w:sz w:val="21"/>
+          <w:szCs w:val="21"/>
+        </w:rPr>
+        <w:t xml:space="preserve">docs/Schema_Laboratorio_v1.0.md, docs/Schema_Formacion_v1.0.md — esquemas normativos de los bancos nuevos.</w:t>
+      </w:r>
+    </w:p>
+    <w:p>
+      <w:pPr>
+        <w:pStyle w:val="ListParagraph"/>
+        <w:numPr>
+          <w:ilvl w:val="0"/>
+          <w:numId w:val="2"/>
+        </w:numPr>
+        <w:spacing w:after="90" w:line="290"/>
+        <w:jc w:val="both"/>
+      </w:pPr>
+      <w:r>
+        <w:rPr>
+          <w:rFonts w:ascii="Georgia" w:cs="Georgia" w:eastAsia="Georgia" w:hAnsi="Georgia"/>
+          <w:color w:val="1F2937"/>
+          <w:sz w:val="21"/>
+          <w:szCs w:val="21"/>
+        </w:rPr>
+        <w:t xml:space="preserve">docs/Laboratorio_Oraciones_Plan_Producto.md, docs/Fabrica_Palabras_Plan_Producto.md — planes de producto y especificación de los dos módulos nuevos.</w:t>
+      </w:r>
+    </w:p>
+    <w:p>
+      <w:pPr>
+        <w:pStyle w:val="ListParagraph"/>
+        <w:numPr>
+          <w:ilvl w:val="0"/>
+          <w:numId w:val="2"/>
+        </w:numPr>
+        <w:spacing w:after="90" w:line="290"/>
+        <w:jc w:val="both"/>
+      </w:pPr>
+      <w:r>
+        <w:rPr>
+          <w:rFonts w:ascii="Georgia" w:cs="Georgia" w:eastAsia="Georgia" w:hAnsi="Georgia"/>
+          <w:color w:val="1F2937"/>
+          <w:sz w:val="21"/>
+          <w:szCs w:val="21"/>
+        </w:rPr>
+        <w:t xml:space="preserve">docs/propuesta_niveles_morfologia.md — diseño del modelo morfológico en tres niveles.</w:t>
+      </w:r>
+    </w:p>
+    <w:p>
+      <w:pPr>
+        <w:pStyle w:val="ListParagraph"/>
+        <w:numPr>
+          <w:ilvl w:val="0"/>
+          <w:numId w:val="2"/>
+        </w:numPr>
+        <w:spacing w:after="90" w:line="290"/>
+        <w:jc w:val="both"/>
+      </w:pPr>
+      <w:r>
+        <w:rPr>
+          <w:rFonts w:ascii="Georgia" w:cs="Georgia" w:eastAsia="Georgia" w:hAnsi="Georgia"/>
+          <w:color w:val="1F2937"/>
+          <w:sz w:val="21"/>
+          <w:szCs w:val="21"/>
+        </w:rPr>
         <w:t xml:space="preserve">docs/f9_ponderacion_morfologia.md — criterios de evaluación y calificación ponderada.</w:t>
+      </w:r>
+    </w:p>
+    <w:p>
+      <w:pPr>
+        <w:pStyle w:val="ListParagraph"/>
+        <w:numPr>
+          <w:ilvl w:val="0"/>
+          <w:numId w:val="2"/>
+        </w:numPr>
+        <w:spacing w:after="90" w:line="290"/>
+        <w:jc w:val="both"/>
+      </w:pPr>
+      <w:r>
+        <w:rPr>
+          <w:rFonts w:ascii="Georgia" w:cs="Georgia" w:eastAsia="Georgia" w:hAnsi="Georgia"/>
+          <w:color w:val="1F2937"/>
+          <w:sz w:val="21"/>
+          <w:szCs w:val="21"/>
+        </w:rPr>
+        <w:t xml:space="preserve">docs/Plan_Semicopulativos_2026-09.md — diagnóstico y diseño del tratamiento de los verbos semicopulativos.</w:t>
       </w:r>
     </w:p>
     <w:p>

</xml_diff>

<commit_message>
docs(registro): añade justificación de ausencia de ejecutable a la memoria v7
El Ministerio pide aportar el ejecutable del programa o, si no se aporta,
justificarlo en la memoria. Se añade un párrafo en el apartado 8 explicando
que, al ser una aplicación web sin compilación, el propio código fuente es
el que ejecuta el navegador.

Co-Authored-By: Claude Sonnet 5 <noreply@anthropic.com>
</commit_message>
<xml_diff>
--- a/Memoria_Ampliacion_Registro_PI_Taller_Sintaxis_v7.docx
+++ b/Memoria_Ampliacion_Registro_PI_Taller_Sintaxis_v7.docx
@@ -10091,6 +10091,25 @@
         </w:tc>
       </w:tr>
     </w:tbl>
+    <w:p>
+      <w:pPr>
+        <w:spacing w:after="240" w:line="300"/>
+        <w:jc w:val="both"/>
+      </w:pPr>
+      <w:r>
+        <w:rPr>
+          <w:rFonts w:ascii="Georgia" w:cs="Georgia" w:eastAsia="Georgia" w:hAnsi="Georgia"/>
+          <w:b w:val="false"/>
+          <w:bCs w:val="false"/>
+          <w:i w:val="false"/>
+          <w:iCs w:val="false"/>
+          <w:color w:val="1F2937"/>
+          <w:sz w:val="21"/>
+          <w:szCs w:val="21"/>
+        </w:rPr>
+        <w:t xml:space="preserve">Ausencia de ejecutable: por tratarse de una aplicación web escrita en JavaScript, HTML y CSS, el programa no se compila a un fichero ejecutable independiente; es el propio código fuente aportado el que el navegador interpreta y ejecuta directamente, tanto en la edición completa como en la edición ligera. El backend (carpeta server/) se ejecuta igualmente sin compilación, como aplicación web de Google Apps Script. Por este motivo no se acompaña ejecutable alguno, de acuerdo con la posibilidad prevista para estos casos.</w:t>
+      </w:r>
+    </w:p>
     <w:p>
       <w:pPr>
         <w:pStyle w:val="Heading2"/>

</xml_diff>